<commit_message>
RUN_STATUS: Phases 6+7 gates closed; Phase 8/9 pipelines running
Co-Authored-By: Claude Fable 5 <noreply@anthropic.com>
</commit_message>
<xml_diff>
--- a/Working_Proposals/TCS/TCS_ROK_Tender_Submission.docx
+++ b/Working_Proposals/TCS/TCS_ROK_Tender_Submission.docx
@@ -1986,7 +1986,7 @@
         <w:spacing w:after="110" w:before="0" w:line="250"/>
       </w:pPr>
       <w:r>
-        <w:t xml:space="preserve">The Paynters Document Register lists 43 volumes, of which 32 were not issued to us. We have not received RRC Addenda 1 to 6 (our set begins at Addendum 7), VOL 35 Civil and Field of Play Technical Specifications, or the ITT Section 27 Appendix Folder. VOL 35 is the governing civil specification: any requirement in it beyond CMDG and the issued drawings is unpriced. Queries A7 and A8 refer.</w:t>
+        <w:t xml:space="preserve">The issued tender Document Register lists 43 volumes, of which 32 were not issued to us. We have not received RRC Addenda 1 to 6 (our set begins at Addendum 7), VOL 35 Civil and Field of Play Technical Specifications, or the ITT Section 27 Appendix Folder. VOL 35 is the governing civil specification: any requirement in it beyond CMDG and the issued drawings is unpriced. Queries A7 and A8 refer.</w:t>
       </w:r>
     </w:p>
     <w:p>
@@ -7676,7 +7676,7 @@
                 <w:sz w:val="18"/>
                 <w:szCs w:val="18"/>
               </w:rPr>
-              <w:t xml:space="preserve">The Paynters Document Register lists 43 volumes; 32 were not issued to us, and RRC Addenda Nos. 1 to 6 were not received in any form (we hold RRC Addenda 7, 8, 9, 10 and the builder-circulated clarifications). Please confirm whether Addenda 1 to 6 contain any change affecting civil stormwater scope, and provide VOL 35 (Civil and Field of Play Technical Specifications).</w:t>
+              <w:t xml:space="preserve">The issued tender Document Register lists 43 volumes; 32 were not issued to us, and RRC Addenda Nos. 1 to 6 were not received in any form (we hold RRC Addenda 7, 8, 9, 10 and the builder-circulated clarifications). Please confirm whether Addenda 1 to 6 contain any change affecting civil stormwater scope, and provide VOL 35 (Civil and Field of Play Technical Specifications).</w:t>
             </w:r>
           </w:p>
         </w:tc>
@@ -7702,7 +7702,7 @@
                 <w:sz w:val="18"/>
                 <w:szCs w:val="18"/>
               </w:rPr>
-              <w:t xml:space="preserve">Paynters Document Register versus documents received</w:t>
+              <w:t xml:space="preserve">Tender Document Register versus documents received</w:t>
             </w:r>
           </w:p>
         </w:tc>

</xml_diff>